<commit_message>
Cafetería Móvil: arreglos de la revisión en plan, Word y checklist (M1, M2, M4, m1-m21, m24; M5 parcial con nota y deuda del motor); cifras del caso sin cambios, D9 12/12
Via: Claude Code
Co-Authored-By: Claude Opus 5.5 <noreply@anthropic.com>
</commit_message>
<xml_diff>
--- a/astro-site/public/dl/plan-negocio-cafeteria-movil-eventos/plan-de-negocio-cafeteria-movil-eventos.docx
+++ b/astro-site/public/dl/plan-negocio-cafeteria-movil-eventos/plan-de-negocio-cafeteria-movil-eventos.docx
@@ -315,7 +315,7 @@
     </w:p>
     <w:p>
       <w:r>
-        <w:t>Este plan describe una barra de café de especialidad para eventos que viaja en furgoneta, con su barra-carro, una cafetera de dos grupos, molinos y energía propia. Trabaja por encargo para bodas, empresas, congresos y celebraciones privadas, y suma unas pocas jornadas de venta directa en mercados y festivales, donde el organizador cobra un canon. No es venta diaria en la calle: ese es otro negocio. La monta una SL unipersonal, con el titular de barista y un camarero o camarera fijo discontinuo, y tiene su base en una nave o un garaje con fregadero. Arranca en marzo, que es el Mes 1 del Excel. El kit incluye este plan de 10 secciones, el Excel de 9 hojas, el checklist de 80 tareas, la calculadora y el modelo de contrato.</w:t>
+        <w:t>Este plan describe una barra de café de especialidad para eventos que viaja en furgoneta, con su barra-carro, una cafetera de dos grupos, molinos y energía propia. Trabaja por encargo para bodas, empresas, congresos y celebraciones privadas, y suma unas pocas jornadas de venta directa en mercados y festivales, donde el organizador cobra un canon. No es venta diaria en la calle: ese es otro negocio. La monta una SL unipersonal, con el titular de barista y un camarero o camarera fijo discontinuo, y tiene su base en una nave o un garaje con fregadero. Arranca en marzo, que es el Mes 1 del Excel. El kit incluye este plan de 10 secciones, el Excel de 9 hojas, el checklist de 80 tareas, la calculadora, el modelo de contrato y la guía de equivalencias para Hispanoamérica.</w:t>
       </w:r>
     </w:p>
     <w:p>
@@ -335,7 +335,7 @@
     </w:p>
     <w:p>
       <w:r>
-        <w:t>El equipo es corto y se apoya en ti. Como titular y barista, vendes, compras, conduces y sirves en cada evento. Te acompaña un camarero o camarera fijo discontinuo, que hace de segundo barista en bodas, congresos y ferias, y una pequeña bolsa de suplencias y refuerzo para vacaciones, bajas y eventos grandes. Son 4 filas en la hoja de personal, con un coste de 44.986 € el primer año. «Barista» no es una categoría del convenio, así que se contrata como camarero o camarera de hostelería. La plantilla crece con personas, no con porcentajes: 6.000 € de incorporaciones en el año 2 y otro tanto en el 3.</w:t>
+        <w:t>El equipo es corto y se apoya en ti. Como titular y barista, vendes, compras, conduces y sirves en cada evento. Te acompaña un camarero o camarera fijo discontinuo, que hace de segundo barista en bodas, congresos y ferias, y una pequeña bolsa de suplencias y refuerzo para la temporada y los eventos grandes. Son 4 filas en la hoja de personal, con un coste de 44.986 € el primer año. «Barista» no es una categoría del convenio, así que se contrata como camarero o camarera de hostelería. La plantilla crece con personas, no con porcentajes: 6.000 € de incorporaciones en el año 2 y otro tanto en el 3.</w:t>
       </w:r>
     </w:p>
     <w:p>
@@ -357,7 +357,7 @@
     </w:p>
     <w:p>
       <w:r>
-        <w:t>Una cafetería móvil puede montarse sobre tres soportes, y conviene elegir antes de comprar nada. La barra-carro con furgoneta es la del caso: un coffee cart, o carrito de café con ruedas, que viaja dentro de una furgoneta y entra en salones, hoteles y pabellones. El Piaggio Ape vende la foto en las bodas, pero es un ciclomotor de 45 km/h como máximo: para ir lejos hay que llevarlo en remolque o furgoneta, y no entra en un pabellón. El remolque cafetería homologado, de hasta 750 kg, circula sin matrícula y con su propia tarjeta ITV. A los dos últimos se les llama a veces coffee trucks, furgonetas de café. Este plan elige la furgoneta porque vende un servicio que debe entrar en recintos muy distintos.</w:t>
+        <w:t>Una cafetería móvil puede montarse sobre tres soportes, y conviene elegir antes de comprar nada. La barra-carro con furgoneta es la del caso: un coffee cart, o carrito de café con ruedas, que viaja dentro de una furgoneta y entra en salones, hoteles y pabellones. El Piaggio Ape vende la foto en las bodas, pero es un ciclomotor de 45 km/h como máximo: para ir lejos hay que llevarlo en remolque o furgoneta, y no entra en un pabellón. El remolque cafetería homologado, de hasta 750 kg, no lleva matrícula propia y sí su tarjeta ITV. A la furgoneta equipada se la llama a veces coffee truck. Este plan elige la furgoneta porque vende un servicio que debe entrar en recintos muy distintos.</w:t>
       </w:r>
     </w:p>
     <w:p>
@@ -409,7 +409,7 @@
     </w:p>
     <w:p>
       <w:r>
-        <w:t>Los precios publicados en Bodas.net (consulta del 28 de octubre de 2026) sirven para situarte, no como precios cerrados: son precios «desde» de escaparate y sin desglose. Hay barras desde 295 € (2 horas ilimitadas, Osuna), 300 € (un Piaggio Ape, Málaga), 450 € (de 20 a 100 invitados, Málaga), 650 € (3 horas, hasta 250 invitados, Barcelona) y 700 € (de 50 a 800 invitados, Barcelona), y desde 1.300 € con IVA en Madrid. La señal va del 30 al 50 %, la hora extra, de 37 a 50 €, y el desplazamiento, a 0,45 € por kilómetro. Nadie publica un precio por invitado y hora: la calculadora del kit lo hace.</w:t>
+        <w:t>Los precios publicados en Bodas.net (consulta del 28 de octubre de 2026) sirven para situarte, no como precios cerrados: son precios «desde» de escaparate y sin desglose. Hay barras desde 295 € (2 horas ilimitadas, Osuna), 300 € (un Piaggio Ape, Málaga), 450 € (de 20 a 100 invitados, Málaga), 650 € (3 horas, hasta 250 invitados, Barcelona) y 700 € (de 50 a 800 invitados, Barcelona), y desde 1.300 € con IVA en Madrid. La señal va del 30 al 50 %, la hora extra, de 37 a 50 €, y el desplazamiento, por kilómetro (0,45 € en una ficha) o con un recargo fijo. Nadie publica un precio por invitado y hora: la calculadora del kit lo hace.</w:t>
       </w:r>
     </w:p>
     <w:p>
@@ -424,7 +424,7 @@
     </w:p>
     <w:p>
       <w:r>
-        <w:t>La demanda tiene riesgos, y el plan los nombra. El primero es la agenda: por debajo de unos 100 servicios al año no hay caja. El segundo, los kilómetros, que se comen la jornada si no los cobras aparte. El tercero, que el cliente se conforme con un coffee break de catering, más barato y sin barista. Se defienden con planners y fincas fijas, empresas que repiten y congresos con calendario, y con un contrato que cierra la fecha.</w:t>
+        <w:t>La demanda tiene riesgos, y el plan los nombra. El primero es la agenda: por debajo de unos 106 servicios del tamaño medio el primer año, y de unos 129 y 139 del mismo tamaño el segundo y el tercero, cuando se devuelve el préstamo, no hay caja (el plan hace el equivalente a 143 y 154). El segundo, los kilómetros, que se comen la jornada si no los cobras aparte. El tercero, que el cliente se conforme con un coffee break de catering, más barato y sin barista. Se defienden con planners y fincas fijas, empresas que repiten y congresos con calendario, y con un contrato que cierra la fecha.</w:t>
       </w:r>
     </w:p>
     <w:p>
@@ -466,12 +466,12 @@
     </w:p>
     <w:p>
       <w:r>
-        <w:t>Cuatro factores deciden si funciona. El primero es la agenda: llegar cuanto antes a unos 100 servicios al año como mínimo, con las fechas de mayo, junio, septiembre y octubre bien vendidas. El segundo es la energía: una cafetera de dos grupos consume de 2,4 a 4,5 kW y un enchufe de 16 A da unos 3,7 kW, así que la del caso es de 3,5 kW como máximo o se pide una toma dedicada, y se confirma por escrito antes de firmar. El tercero son los kilómetros, que se cobran aparte. El cuarto es el café constante, con la ficha del tostador a mano.</w:t>
+        <w:t>Cuatro factores deciden si funciona. El primero es la agenda: pasar cuanto antes de los 106 servicios del equilibrio de caja, con las fechas de mayo, junio, septiembre y octubre bien vendidas. El segundo es la energía: una cafetera de dos grupos consume de 2,4 a 4,5 kW y un enchufe de 16 A da unos 3,7 kW, así que la del caso es de 3,5 kW como máximo o se pide una toma dedicada, y se confirma por escrito antes de firmar. El tercero son los kilómetros, que se cobran aparte. El cuarto es el café constante, con la ficha del tostador a mano.</w:t>
       </w:r>
     </w:p>
     <w:p>
       <w:r>
-        <w:t>El DAFO de este concepto es claro. Fortalezas: una inversión contenida, una mercancía pequeña y un margen bruto del 70,8 % en el primer año. Debilidades: una factura baja por evento, de de 837 € por evento, y un personal que pesa el 41,3 % de las ventas. Oportunidades: el hueco de información, porque nadie publica el precio por invitado ni resuelve la electricidad antes de firmar, y los congresos con calendario. Amenazas: los tostadores con barra propia, el coffee break del catering y una agenda que no se llene, con el equilibrio de caja en 106 eventos del tamaño medio.</w:t>
+        <w:t>El DAFO de este concepto es claro. Fortalezas: una inversión contenida, una mercancía pequeña y un margen bruto del 70,8 % en el primer año. Debilidades: una factura media baja, de 837 € por evento, y un personal que pesa el 41,3 % de las ventas. Oportunidades: el hueco de información, porque nadie publica el precio por invitado ni resuelve la electricidad antes de firmar, y los congresos con calendario. Amenazas: los tostadores con barra propia, el coffee break del catering y una agenda que no se llene, con el equilibrio de caja en 106 eventos del tamaño medio.</w:t>
       </w:r>
     </w:p>
     <w:p>
@@ -513,12 +513,12 @@
     </w:p>
     <w:p>
       <w:r>
-        <w:t>La calculadora del kit presupuesta por invitado y por horas; el desplazamiento se cobra aparte, por kilómetro y sin margen. Su boda de ejemplo, con 120 invitados y una barra de 3 horas tras la cena, en loza, sale a 8,00 € por invitado sin IVA con el margen objetivo del 55 % (1.091 € con IVA y desplazamiento); la boda media del plan, a 9,00 €, deja más margen. El congreso de ejemplo, con 300 asistentes y una jornada con dos pausas, sale a 4,50 € por asistente. El contrato cierra el resto: sin desistimiento de 14 días en un servicio de ocio con fecha cerrado a distancia (art. 103.l del TRLGDCU), plan B de lluvia que no es fuerza mayor y el fuero del domicilio del consumidor (art. 90.2).</w:t>
+        <w:t>La calculadora del kit presupuesta por invitado y por horas; el desplazamiento se cobra aparte, por kilómetro y sin margen. Su boda de ejemplo, con 120 invitados y una barra de 3 horas tras la cena, en loza, sale a un precio mínimo de 8,00 € por invitado sin IVA para llegar al margen objetivo del 55 % (1.091 € con IVA y desplazamiento); la boda media del plan, a 9,00 €, deja más margen. El congreso de ejemplo, con 300 asistentes y una jornada con dos pausas, sale a 4,50 € por asistente. El contrato cierra el resto: sin desistimiento de 14 días en un servicio de ocio con fecha cerrado a distancia (art. 103.l del TRLGDCU), plan B de lluvia que no es fuerza mayor y el fuero del domicilio del consumidor (art. 90.2).</w:t>
       </w:r>
     </w:p>
     <w:p>
       <w:r>
-        <w:t>El particular paga una señal del 30 % a cuenta del precio al firmar y el 70 % siete días antes; la empresa o el congreso, el 30 % al confirmar y el 70 % a 30 días de la factura; en ferias y mercados, en el acto. Cada pago se factura, también la señal (art. 75.Dos de la Ley 37/1992). La cancelación va en cuatro tramos «de X a menos de Y»: cortes a 60, 30 y 7 días el particular y a 30, 15 y 7 la empresa. Se retiene el 10, el 30, el 60 o el 100 % del precio, menos los costes que la cafetería se ahorra, y es recíproca: si cancela ella, devuelve lo cobrado y paga lo del mismo tramo.</w:t>
+        <w:t>El particular paga una señal del 30 % a cuenta del precio al firmar y el 70 % siete días antes; la empresa o el congreso, el 30 % al confirmar y el 70 % a 30 días de la factura; en ferias y mercados, en el acto. Cada pago se factura, también la señal (art. 75.Dos de la Ley 37/1992). La cancelación va en cuatro tramos «de X a menos de Y»: cortes a 60, 30 y 7 días el particular y a 30, 15 y 7 la empresa. Se retiene el 10, el 30 o el 60 % del precio, y en el último tramo el 100 % menos los costes que la cafetería se ahorra, y es recíproca: si cancela ella, devuelve lo cobrado y paga lo del mismo tramo.</w:t>
       </w:r>
     </w:p>
     <w:p>
@@ -555,7 +555,7 @@
     </w:p>
     <w:p>
       <w:r>
-        <w:t>La electricidad es lo primero que conviene preguntar y lo último que se suele comprobar. Una cafetera de dos grupos consume de 2,4 a 4,5 kW, y un enchufe de 16 A a 230 V da unos 3,7 kW. Por eso la cafetera del caso es de 3,5 kW como máximo; si la tuya pide más, necesitas una toma dedicada. Con 200 o 300 invitados la tabla sube a 7,0 kW con dos cafeteras, y la toma pasa a ser toma dedicada o generador. Si el recinto no ofrece lo que necesitas, la salida es un generador inverter de 5 kVA o más, o baterías de litio, que son silenciosas y las que conviene llevar a las bodas. El contrato del kit pide la toma por escrito. Sin ese compromiso, no firmes la fecha.</w:t>
+        <w:t>La electricidad es lo primero que conviene preguntar y lo último que se suele comprobar. Una cafetera de dos grupos consume de 2,4 a 4,5 kW, y un enchufe de 16 A a 230 V da unos 3,7 kW. Por eso la cafetera del caso es de 3,5 kW como máximo; si la tuya pide más, necesitas una toma dedicada. Con 200 o 300 invitados la tabla sube a 7,0 kW con dos cafeteras, y la toma pasa a ser toma dedicada o generador. Si el recinto no ofrece lo que necesitas, la salida es un generador inverter de 5 kVA o más, o baterías de litio, más silenciosas para las bodas pero más caras (6.000-10.000 € un sistema completo, por encima de la partida de energía del caso). El contrato del kit pide la toma por escrito. Sin ese compromiso, no firmes la fecha.</w:t>
       </w:r>
     </w:p>
     <w:p>
@@ -587,7 +587,7 @@
     </w:p>
     <w:p>
       <w:r>
-        <w:t>El equipo propio es corto, porque el negocio es pequeño y hay que pagarlo con ventas. Tú eres el titular y el barista: vendes, compras, conduces y sirves en cada evento, con un sueldo de 1.800 € brutos al mes en 14 pagas. Como administrador de la SL cotizas en el régimen de autónomos; confírmalo con tu gestoría. A tu lado hay un camarero o camarera de barra fijo discontinuo al 36 % de jornada, unas 650 horas al año, que hace de segundo barista en bodas, congresos, ferias y la mitad de los eventos de empresa, con 504 € brutos al mes. Completan la bolsa dos filas pequeñas: suplencias de vacaciones y bajas, y refuerzo para los eventos grandes.</w:t>
+        <w:t>El equipo propio es corto, porque el negocio es pequeño y hay que pagarlo con ventas. Tú eres el titular y el barista: vendes, compras, conduces y sirves en cada evento, con un sueldo de 1.800 € brutos al mes en 14 pagas. Como administrador de la SL cotizas en el régimen de autónomos; confírmalo con tu gestoría. A tu lado hay un camarero o camarera de barra fijo discontinuo al 36 % de jornada, unas 650 horas al año, que hace de segundo barista en bodas, congresos, ferias y la mitad de los eventos de empresa, con 504 € brutos al mes. Completan la bolsa dos filas pequeñas: suplencias y refuerzo de temporada, y un tercer barista para los eventos grandes.</w:t>
       </w:r>
     </w:p>
     <w:p>
@@ -597,7 +597,7 @@
     </w:p>
     <w:p>
       <w:r>
-        <w:t>Tu camarero o camarera de barra y la bolsa de refuerzo van con contrato fijo discontinuo (art. 16 del Estatuto de los Trabajadores). Es un contrato indefinido: la persona no desaparece al acabar la temporada, sino que la llamas por escrito cuando hay trabajo, y debe estar dada de alta en la Seguridad Social antes de cada llamamiento. Para ti tiene una ventaja clara: cuentas con gente que ya conoce tu barra en los meses fuertes sin pagar horas en los flojos. Para ella, estabilidad y derecho al llamamiento. Lleva además el registro de jornada (art. 34.9), también el de las horas de oficina y de limpieza.</w:t>
+        <w:t>Tu camarero o camarera de barra y la bolsa de refuerzo van con contrato fijo discontinuo (art. 16 del Estatuto de los Trabajadores). Es un contrato indefinido: la persona no desaparece al acabar la temporada, sino que la llamas por escrito cuando hay trabajo, y debe estar dada de alta en la Seguridad Social antes de cada llamamiento. Para ti tiene una ventaja clara: cuentas con gente que ya conoce tu barra en los meses fuertes sin pagar horas en los flojos. Para ella, estabilidad y derecho al llamamiento. Para cubrir una baja concreta, el contrato es de sustitución (art. 15.3). Lleva además el registro de jornada (art. 34.9), también el de las horas de oficina y de limpieza.</w:t>
       </w:r>
     </w:p>
     <w:p>
@@ -634,12 +634,12 @@
     </w:p>
     <w:p>
       <w:r>
-        <w:t>Para arrancar necesitas 60.061 €: 44.416 € de compras (la furgoneta, el equipo y la puesta en marcha, 43.216 € con los imprevistos de la furgoneta, más la fianza de 800 € y 400 € de cuota antes del primer evento) y 15.645 € de fondo de maniobra. El IVA de la inversión, 8.949 €, también hay que adelantarlo, así que la necesidad de caja sube a 69.010 €. Se financia con 25.000 € propios y un préstamo de 44.500 € al 6,5 % a 6 años, con 1 año de carencia y una cuota de 10.708 € al año.</w:t>
+        <w:t>Para arrancar necesitas 60.061 €: 44.416 € de inversión (la furgoneta, el equipo y la puesta en marcha, 43.216 € con los imprevistos de la furgoneta, más la fianza de 800 € y 400 € de cuota antes del primer evento) y 15.645 € de fondo de maniobra. El IVA de la inversión, 8.949 €, también hay que adelantarlo, así que la necesidad de caja sube a 69.010 €. Se financia con 25.000 € propios y un préstamo de 44.500 € al 6,5 % a 6 años, con 1 año de carencia y una cuota de 10.708 € al año.</w:t>
       </w:r>
     </w:p>
     <w:p>
       <w:r>
-        <w:t>La cuenta de resultados a tres años proyecta unas ventas de 108.810 €, 119.691 € y 129.266 €. El primer año cuenta 130 eventos de 135 invitados de media, a 6,20 € por invitado sin IVA; de esas ventas, 9.140 € (8,4 %) son venta directa en ferias y mercados. El margen bruto es de 77.081 € (70,8 %), después de todos los costes variables: la mercancía (19,3 % de las ventas), los consumibles, el canon de las ferias (1.371 €), los medios de pago y los varios. De ahí salen el personal (44.986 €) y la cuota del almacén base (4.800 €), y queda un resultado de explotación antes de amortizaciones e intereses de 17.395 € (16,0 %). Después de amortizar, pagar intereses e impuestos, el neto es de 8.840 €, 10.292 € y 10.050 € (8,1 %, 8,6 % y 7,8 % de las ventas). El año 3 tributa ya al tipo general del Impuesto de Sociedades (25 %); los dos primeros años aplican el 15 %.</w:t>
+        <w:t>La cuenta de resultados a tres años proyecta unas ventas de 108.810 €, 119.691 € y 129.266 €. El primer año cuenta 130 eventos de 135 invitados de media, a 6,20 € por invitado sin IVA; de esas ventas, 9.140 € (8,4 %) son venta directa en ferias y mercados. El margen bruto es de 77.081 € (70,8 %), después de todos los costes variables: la mercancía (19,3 % de las ventas), los consumibles, el canon de las ferias (1.371 €), los medios de pago y los varios. De ahí salen el personal (44.986 €), la cuota del almacén base (4.800 €) y el resto de gastos fijos (9.900 €: suministros, seguros, asesoría, marketing, mantenimiento y tasas), y queda un resultado de explotación antes de amortizaciones e intereses de 17.395 € (16,0 %). Después de amortizar, pagar intereses e impuestos, el neto es de 8.840 €, 10.292 € y 10.050 € (8,1 %, 8,6 % y 7,8 % de las ventas). Los dos primeros ejercicios con base positiva aplican el 15 % de empresa de nueva creación y el tercero, el tipo general del 25 %; si tu cifra de negocios queda por debajo de 1 millón o de 10 millones de euros, desde 2025 hay tipos más bajos que se implantan de forma gradual: confírmalo con tu asesor.</w:t>
       </w:r>
     </w:p>
     <w:p>
@@ -654,12 +654,12 @@
     </w:p>
     <w:p>
       <w:r>
-        <w:t>La tesorería numera los meses del 1 al 12, y el Mes 1 es marzo. Se hace así porque el café se reserva con uno a seis meses de antelación, se arranca en primavera con las empresas y las comuniones, y enero y febrero, los meses más flojos, llegan con la caja de la temporada. La rampa empieza al 45 % y llega al ritmo de crucero en 9 meses. El saldo mínimo es de 12.124 €, en el Mes 2 (abril), y el año acaba en febrero con 30.156 €. Las pagas extra salen en julio y en diciembre.</w:t>
+        <w:t>La tesorería numera los meses del 1 al 12, y el Mes 1 es marzo. Se hace así porque el café se reserva con una semana a seis meses de antelación, la mayoría con uno o más meses, se arranca en primavera con las empresas y las comuniones, y enero y febrero, los meses más flojos, llegan con la caja de la temporada. La rampa empieza al 45 % y llega al ritmo de crucero en 9 meses. El saldo mínimo es de 12.124 €, en el Mes 2 (abril), y el año acaba en febrero con 30.156 €. Las pagas extra salen en julio y en diciembre.</w:t>
       </w:r>
     </w:p>
     <w:p>
       <w:r>
-        <w:t>El DSCR mínimo es de 1,54 (1,61 el segundo año y 1,54 el tercero): el negocio cubre la deuda, pero sin mucho colchón. Sobre el payback, el Excel marca «Más de 3 años» en la fila «Payback del proyecto (años), antes de la deuda»; sobre el CAPEX sin el fondo de maniobra serían 2,7 años. No prometas plazos al banco: enséñale las fechas ya reservadas.</w:t>
+        <w:t>El DSCR mínimo es de 1,54 (1,61 el segundo año y 1,54 el tercero): el negocio cubre la deuda con margen sobre el 1,25 que suele pedir un banco, aunque no sobrado. Sobre el payback, el Excel marca «Más de 3 años» en la fila «Payback del proyecto (años), antes de la deuda»; sobre el CAPEX sin el fondo de maniobra serían 2,7 años. No prometas plazos al banco: enséñale las fechas ya reservadas.</w:t>
       </w:r>
     </w:p>
     <w:p>
@@ -691,7 +691,7 @@
     </w:p>
     <w:p>
       <w:r>
-        <w:t>En sanidad, presentas una declaración responsable en el registro sanitario de la comunidad autónoma donde tienes la base (RD 1021/2022). El vehículo y la barra forman parte del establecimiento, y la base necesita fregadero: nada se prepara en casa (art. 13.5.b). El RGSEAA solo te afecta si vendes a otros negocios. La comida testigo (RD 1086/2020, arts. 2.h, 30.8.d y 30.10) es obligatoria cuando sirves salado, como sándwiches, tostas o quiches: una ración de 100 g o más de cada uno, durante 7 días y en cada evento. Las bebidas y la bollería servida tal cual quedan fuera según nuestra lectura, sin criterio oficial: confírmalo con tu autoridad sanitaria.</w:t>
+        <w:t>En sanidad, presentas una declaración responsable en el registro sanitario de la comunidad autónoma donde tienes la base (RD 1021/2022). El vehículo y la barra forman parte del establecimiento, y la base necesita fregadero; lo que sirves en eventos no se puede preparar en casa (art. 13.5.b del RD 1021/2022). El RGSEAA solo te afecta si vendes a otros negocios. La comida testigo (RD 1086/2020, arts. 2.h, 30.8.d y 30.10) es obligatoria cuando sirves salado, como sándwiches, tostas o quiches: una ración de 100 g o más de cada uno, a 4 °C o menos (o congelada), durante 7 días y en cada evento. Las bebidas y la bollería servida tal cual quedan fuera según nuestra lectura, sin criterio oficial: confírmalo con tu autoridad sanitaria.</w:t>
       </w:r>
     </w:p>
     <w:p>
@@ -701,12 +701,12 @@
     </w:p>
     <w:p>
       <w:r>
-        <w:t>El vaso de papel con forro de PE o PLA también es plástico (Ley 7/2022, art. 2.aa), así que el «compostable» no te saca de la norma. Se cobra aparte en el tique (art. 55.2), y las pajitas y los agitadores de plástico están prohibidos (art. 56). Además, los promotores de eventos festivos tienen que ofrecer alternativas al vaso de un solo uso (RD 1055/2022, art. 7.6). Por eso el plan usa loza por defecto en bodas y empresa, y vaso de un solo uso solo en la venta directa, con su precio visible. En ferias y festivales, usa el sistema de vaso reutilizable del organizador.</w:t>
+        <w:t>El vaso de papel con forro de PE o PLA también es plástico (Ley 7/2022, art. 2.aa), así que el «compostable» no te saca de la norma. Se cobra aparte en el tique (art. 55.2), y las pajitas y los agitadores de plástico están prohibidos (art. 56). Además, los promotores de eventos festivos tienen que ofrecer alternativas al vaso de un solo uso (RD 1055/2022, art. 7.6). No está claro que una boda o un evento de empresa cuenten como evento festivo, así que el plan usa loza por defecto en bodas y empresa, y vaso de un solo uso solo en la venta directa, con su precio visible. En ferias y festivales, usa el sistema de vaso reutilizable del organizador.</w:t>
       </w:r>
     </w:p>
     <w:p>
       <w:r>
-        <w:t>La venta en mercados y en la vía pública es venta no sedentaria y necesita autorización municipal (RD 199/2010); el evento contratado en un recinto privado, en cambio, es un servicio. Un remolque de hasta 750 kg va sin matrícula y con tarjeta ITV (Reglamento General de Vehículos, arts. 25-26). Si equipas una furgoneta con mueble, fregadero o depósitos fijos, es una reforma: compruébalo con tu estación de ITV. El Ape 50 es un ciclomotor de 45 km/h.</w:t>
+        <w:t>La venta en mercados y en la vía pública es venta no sedentaria y necesita autorización municipal (RD 199/2010); el evento contratado en un recinto privado, en cambio, es un servicio. Un remolque de hasta 750 kg no lleva matrícula propia y sí tarjeta ITV (Reglamento General de Vehículos, arts. 25-26). Si equipas una furgoneta con mueble, fregadero o depósitos fijos, es una reforma: compruébalo con tu estación de ITV. El Ape 50 es un ciclomotor de 45 km/h.</w:t>
       </w:r>
     </w:p>
     <w:p>
@@ -716,7 +716,7 @@
     </w:p>
     <w:p>
       <w:r>
-        <w:t>El particular paga el 30 % al firmar, a cuenta del precio, y el 70 % siete días antes; la empresa, el 30 % al confirmar y el 70 % a 30 días de la factura; en ferias y mercados, en el acto. La cancelación tiene cuatro tramos «de X a menos de Y», con cortes en 60, 30 y 7 días para el particular y en 30, 15 y 7 para la empresa: se retiene el 10 %, el 30 %, el 60 % o el 100 % del precio, menos los costes que te ahorras, y es recíproca. Cerrado a distancia, no hay desistimiento de 14 días (art. 103.l del TRLGDCU) y el fuero es el del consumidor (art. 90.2).</w:t>
+        <w:t>El particular paga el 30 % al firmar, a cuenta del precio, y el 70 % siete días antes; la empresa, el 30 % al confirmar y el 70 % a 30 días de la factura; en ferias y mercados, en el acto. La cancelación tiene cuatro tramos «de X a menos de Y», con cortes en 60, 30 y 7 días para el particular y en 30, 15 y 7 para la empresa: se retiene el 10 %, el 30 % o el 60 % del precio, y en el último tramo el 100 % menos los costes que te ahorras, y es recíproca. Cerrado a distancia, no hay desistimiento de 14 días (art. 103.l del TRLGDCU) y el fuero es el del consumidor (art. 90.2).</w:t>
       </w:r>
     </w:p>
     <w:p>
@@ -738,12 +738,12 @@
     </w:p>
     <w:p>
       <w:r>
-        <w:t>La conclusión es que una cafetería móvil para eventos como la del caso es viable, pero exige método y una agenda vendida con antelación. Con 130 eventos, el primer año deja un neto de 8.840 € y una holgura de caja del 23,2 %, la del año de carencia. Cuando empieza a devolverse el principal, la holgura baja al 11,0 % el segundo año y al 11,1 % el tercero, y el DSCR mínimo es de 1,54: se cubre la deuda sin mucho colchón. El saldo mínimo de tesorería es de 12.124 €, en el Mes 2 (abril). En la fila «Payback del proyecto (años), antes de la deuda» el Excel marca «Más de 3 años»: la inversión no se recupera deprisa, y por eso el banco querrá ver fechas ya vendidas.</w:t>
+        <w:t>La conclusión es que una cafetería móvil para eventos como la del caso es viable, pero exige método y una agenda vendida con antelación. Con 130 eventos, el primer año deja un neto de 8.840 € y una holgura de caja del 23,2 %, la del año de carencia. Cuando empieza a devolverse el principal, la holgura baja al 11,0 % el segundo año y al 11,1 % el tercero, y el DSCR mínimo es de 1,54: se cubre la deuda con margen sobre el 1,25 que suele pedir un banco, aunque no sobrado. El saldo mínimo de tesorería es de 12.124 €, en el Mes 2 (abril). En la fila «Payback del proyecto (años), antes de la deuda» el Excel marca «Más de 3 años»: la inversión no se recupera deprisa, y por eso el banco querrá ver fechas ya vendidas.</w:t>
       </w:r>
     </w:p>
     <w:p>
       <w:r>
-        <w:t>Los riesgos de una cafetería móvil son concretos, y cada uno tiene su defensa. El primero es la agenda: por debajo de unos 100 servicios al año no hay caja. Se mitiga con congresos que tienen calendario, wedding planners (organizadores de bodas) que te recomiendan y empresas que repiten. El segundo es presupuestar un servicio de 2 horas como si fueran 2 horas: en realidad es una jornada de 7 a 9 horas, con carga, trayecto, montaje, desmontaje, limpieza y vuelta, y la calculadora lo cuenta así. El tercero es firmar sin saber la potencia eléctrica del recinto. Se resuelve con la toma por escrito en el contrato, con una cafetera de 3,5 kW como máximo si solo hay un enchufe de 16 A, o con un generador inverter o baterías de litio.</w:t>
+        <w:t>Los riesgos de una cafetería móvil son concretos, y cada uno tiene su defensa. El primero es la agenda: por debajo de unos 106 servicios del tamaño medio el primer año, y de unos 129 y 139 del mismo tamaño el segundo y el tercero, cuando se devuelve el préstamo, no hay caja. Se mitiga con congresos que tienen calendario, wedding planners (organizadores de bodas) que te recomiendan y empresas que repiten. El segundo es presupuestar un servicio de 2 horas como si fueran 2 horas: en realidad es una jornada de 7 a 9 horas, con carga, trayecto, montaje, desmontaje, limpieza y vuelta, y la calculadora lo cuenta así. El tercero es firmar sin saber la potencia eléctrica del recinto. Se resuelve con la toma por escrito en el contrato, con una cafetera de 3,5 kW como máximo si solo hay un enchufe de 16 A, o con un generador inverter o baterías de litio.</w:t>
       </w:r>
     </w:p>
     <w:p>
@@ -753,12 +753,12 @@
     </w:p>
     <w:p>
       <w:r>
-        <w:t>El séptimo riesgo es vender en la calle como si fuera un evento: la venta en mercados y en la vía pública necesita autorización municipal (RD 199/2010), mientras que el evento en un recinto privado es otro tipo de servicio. Pide el permiso o elige solo mercados y festivales con organizador. El octavo son los kilómetros sin cobrar: el combustible, el tiempo al volante y el desgaste de la furgoneta salen de tu margen si no los pones aparte, así que cobra el desplazamiento por kilómetro, como hace la calculadora. El noveno es contratar al barista como autónomo que te factura con tu horario: es falso autónomo (art. 1.1 del Estatuto de los Trabajadores). Contrátalo como fijo discontinuo, con alta antes de cada llamamiento y registro de jornada. Ninguno de los tres sale en el Excel, y por eso conviene escribirlos en tu contrato y en tu rutina semanal.</w:t>
+        <w:t>El séptimo riesgo es vender en la calle como si fuera un evento: la venta en mercados y en la vía pública necesita autorización municipal (RD 199/2010), mientras que el evento en un recinto privado es otro tipo de servicio. Pide el permiso o elige solo mercados y festivales con organizador. El octavo son los kilómetros sin cobrar: el combustible, el tiempo al volante y el desgaste de la furgoneta salen de tu margen si no los pones aparte, así que cobra el desplazamiento por kilómetro, como hace la calculadora. El noveno es contratar al barista como autónomo que te factura con tu horario: es falso autónomo (art. 1.1 del Estatuto de los Trabajadores). Contrátalo como fijo discontinuo, con alta antes de cada llamamiento y registro de jornada. El Excel carga el combustible en «varios», pero ni el permiso, ni el cobro de los kilómetros, ni el tipo de contrato se ven en sus cifras: por eso conviene escribirlos en tu contrato y en tu rutina semanal.</w:t>
       </w:r>
     </w:p>
     <w:p>
       <w:r>
-        <w:t>El checklist del kit ordena la apertura en 6 fases y 80 tareas: 12, 16, 14, 10, 14 y 14. No es un calendario rígido, sino un orden de trabajo, y cada fase acaba con cosas cerradas antes de pasar a la siguiente. Conviene no saltarse ninguna, porque en este negocio los errores caros se cometen al principio: firmar una fecha sin saber la potencia eléctrica, comprar un equipo sin haber hecho números o anunciar «café de especialidad» sin la ficha del tostador. Marca las tareas según las vayas cerrando, anota la fecha y el nombre de quien las hizo, y vuelve a mirar la lista cada mes: así sabrás en qué punto estás, cuánto te queda por hacer y qué te falta para tu primer encargo.</w:t>
+        <w:t>El checklist del kit ordena la apertura en 6 fases y 80 tareas: 12, 16, 14, 10, 14 y 14. No es un calendario rígido, sino un orden de trabajo, y cada fase acaba con cosas cerradas antes de pasar a la siguiente. Conviene no saltarse ninguna, porque en este negocio los errores caros se cometen al principio: firmar una fecha sin saber la potencia eléctrica, comprar un equipo sin haber hecho números o anunciar «café de especialidad» sin la ficha del tostador. Marca las tareas según las vayas cerrando, anota en NOTAS la fecha y quién las cerró, y vuelve a mirar la lista cada mes: así sabrás en qué punto estás, cuánto te queda por hacer y qué te falta para tu primer encargo.</w:t>
       </w:r>
     </w:p>
     <w:p>

</xml_diff>